<commit_message>
Fix non-product filtering and regenerate pipeline
</commit_message>
<xml_diff>
--- a/memo.docx
+++ b/memo.docx
@@ -73,12 +73,12 @@
     </w:p>
     <w:p>
       <w:r>
-        <w:t xml:space="preserve">Compared with a dense representation, using 100 SVD components reduces the matrix from about 189.83 MB to 7.65 MB, a 95.97% reduction. The original sparse matrix itself requires only 4.80 MB, so the main benefit of SVD here is fast recommendation scoring rather than storage alone. </w:t>
-      </w:r>
-    </w:p>
-    <w:p>
-      <w:r>
-        <w:t xml:space="preserve">The recommendation system achieved a Hit Rate@10 of 20.26%, compared with 17.25% for the best-seller baseline, an improvement of about 3 percentage points. Generating top-10 recommendations for 1,930 customers took 1.49 seconds, showing that the personalized model outperformed the baseline while remaining fast enough for a nightly recommendation process. </w:t>
+        <w:t xml:space="preserve">Compared with a dense representation, using 100 SVD components reduces the matrix from about 189.15 MB to 7.63 MB, a 95.97% reduction. The original sparse matrix itself requires only 4.80 MB, so the main benefit of SVD here is fast recommendation scoring rather than storage alone. </w:t>
+      </w:r>
+    </w:p>
+    <w:p>
+      <w:r>
+        <w:t xml:space="preserve">The recommendation system achieved a Hit Rate@10 of 20.60%, compared with 17.28% for the best-seller baseline, an improvement of about 3.3 percentage points. Generating top-10 recommendations for 1,927 customers took 1.40 seconds, showing that the personalized model outperformed the baseline while remaining fast enough for a nightly recommendation process. </w:t>
       </w:r>
     </w:p>
     <w:p>
@@ -152,7 +152,7 @@
         <w:spacing w:after="20"/>
       </w:pPr>
       <w:r>
-        <w:t>Home &amp; Utility</w:t>
+        <w:t>Home &amp; Utility — 2,375 customers</w:t>
       </w:r>
     </w:p>
     <w:p>
@@ -164,7 +164,7 @@
         <w:spacing w:after="20"/>
       </w:pPr>
       <w:r>
-        <w:t>Novelty &amp; Party</w:t>
+        <w:t>Novelty &amp; Party — 1,575 customers</w:t>
       </w:r>
     </w:p>
     <w:p>
@@ -176,7 +176,7 @@
         <w:spacing w:after="20"/>
       </w:pPr>
       <w:r>
-        <w:t>Bags &amp; Storage</w:t>
+        <w:t>Decorative Homeware — 831 customers</w:t>
       </w:r>
     </w:p>
     <w:p>
@@ -188,7 +188,7 @@
         <w:spacing w:after="20"/>
       </w:pPr>
       <w:r>
-        <w:t>Decorative Homeware</w:t>
+        <w:t>Bags &amp; Storage — 693 customers</w:t>
       </w:r>
     </w:p>
     <w:p>

</xml_diff>

<commit_message>
update 04_svd_model.ipynv and memo
</commit_message>
<xml_diff>
--- a/memo.docx
+++ b/memo.docx
@@ -78,7 +78,13 @@
     </w:p>
     <w:p>
       <w:r>
-        <w:t xml:space="preserve">The recommendation system achieved a Hit Rate@10 of 20.60%, compared with 17.28% for the best-seller baseline, an improvement of about 3.3 percentage points. Generating top-10 recommendations for 1,927 customers took 1.40 seconds, showing that the personalized model outperformed the baseline while remaining fast enough for a nightly recommendation process. </w:t>
+        <w:t>The recommendation system achieved a Hit Rate@10 of 20.60%, compared with 17.28% for the best-seller baseline, an improvement of about 3.3 percentage points. Generating top</w:t>
+      </w:r>
+      <w:r>
+        <w:t xml:space="preserve"> </w:t>
+      </w:r>
+      <w:r>
+        <w:t xml:space="preserve">10 recommendations for 1,927 customers took 1.56 seconds, showing that the personalized model outperformed the baseline while remaining fast enough for a nightly recommendation process. </w:t>
       </w:r>
     </w:p>
     <w:p>
@@ -143,54 +149,114 @@
         <w:t>The analysis identified four broad customer segments:</w:t>
       </w:r>
     </w:p>
-    <w:p>
-      <w:pPr>
-        <w:numPr>
-          <w:ilvl w:val="0"/>
-          <w:numId w:val="1"/>
-        </w:numPr>
-        <w:spacing w:after="20"/>
-      </w:pPr>
-      <w:r>
-        <w:t>Home &amp; Utility — 2,375 customers</w:t>
-      </w:r>
-    </w:p>
-    <w:p>
-      <w:pPr>
-        <w:numPr>
-          <w:ilvl w:val="0"/>
-          <w:numId w:val="1"/>
-        </w:numPr>
-        <w:spacing w:after="20"/>
-      </w:pPr>
-      <w:r>
-        <w:t>Novelty &amp; Party — 1,575 customers</w:t>
-      </w:r>
-    </w:p>
-    <w:p>
-      <w:pPr>
-        <w:numPr>
-          <w:ilvl w:val="0"/>
-          <w:numId w:val="1"/>
-        </w:numPr>
-        <w:spacing w:after="20"/>
-      </w:pPr>
-      <w:r>
-        <w:t>Decorative Homeware — 831 customers</w:t>
-      </w:r>
-    </w:p>
-    <w:p>
-      <w:pPr>
-        <w:numPr>
-          <w:ilvl w:val="0"/>
-          <w:numId w:val="1"/>
-        </w:numPr>
-        <w:spacing w:after="20"/>
-      </w:pPr>
-      <w:r>
-        <w:t>Bags &amp; Storage — 693 customers</w:t>
-      </w:r>
-    </w:p>
+    <w:tbl>
+      <w:tblPr>
+        <w:tblStyle w:val="TableGrid"/>
+        <w:tblW w:w="0" w:type="auto"/>
+        <w:tblLook w:val="04A0" w:firstRow="1" w:lastRow="0" w:firstColumn="1" w:lastColumn="0" w:noHBand="0" w:noVBand="1"/>
+      </w:tblPr>
+      <w:tblGrid>
+        <w:gridCol w:w="2785"/>
+        <w:gridCol w:w="2160"/>
+      </w:tblGrid>
+      <w:tr>
+        <w:tc>
+          <w:tcPr>
+            <w:tcW w:w="2785" w:type="dxa"/>
+          </w:tcPr>
+          <w:p>
+            <w:r>
+              <w:t>Home &amp; Utility</w:t>
+            </w:r>
+          </w:p>
+        </w:tc>
+        <w:tc>
+          <w:tcPr>
+            <w:tcW w:w="2160" w:type="dxa"/>
+          </w:tcPr>
+          <w:p>
+            <w:pPr>
+              <w:spacing w:after="20"/>
+            </w:pPr>
+            <w:r>
+              <w:t>2,375 customers</w:t>
+            </w:r>
+          </w:p>
+        </w:tc>
+      </w:tr>
+      <w:tr>
+        <w:tc>
+          <w:tcPr>
+            <w:tcW w:w="2785" w:type="dxa"/>
+          </w:tcPr>
+          <w:p>
+            <w:pPr>
+              <w:spacing w:after="20"/>
+            </w:pPr>
+            <w:r>
+              <w:t>Novelty &amp; Party</w:t>
+            </w:r>
+          </w:p>
+        </w:tc>
+        <w:tc>
+          <w:tcPr>
+            <w:tcW w:w="2160" w:type="dxa"/>
+          </w:tcPr>
+          <w:p>
+            <w:r>
+              <w:t>1,575 customers</w:t>
+            </w:r>
+          </w:p>
+        </w:tc>
+      </w:tr>
+      <w:tr>
+        <w:tc>
+          <w:tcPr>
+            <w:tcW w:w="2785" w:type="dxa"/>
+          </w:tcPr>
+          <w:p>
+            <w:r>
+              <w:t>Decorative Homeware</w:t>
+            </w:r>
+          </w:p>
+        </w:tc>
+        <w:tc>
+          <w:tcPr>
+            <w:tcW w:w="2160" w:type="dxa"/>
+          </w:tcPr>
+          <w:p>
+            <w:r>
+              <w:t>831 customers</w:t>
+            </w:r>
+          </w:p>
+        </w:tc>
+      </w:tr>
+      <w:tr>
+        <w:tc>
+          <w:tcPr>
+            <w:tcW w:w="2785" w:type="dxa"/>
+          </w:tcPr>
+          <w:p>
+            <w:r>
+              <w:t>Bags &amp; Storage</w:t>
+            </w:r>
+          </w:p>
+        </w:tc>
+        <w:tc>
+          <w:tcPr>
+            <w:tcW w:w="2160" w:type="dxa"/>
+          </w:tcPr>
+          <w:p>
+            <w:pPr>
+              <w:spacing w:after="20"/>
+            </w:pPr>
+            <w:r>
+              <w:t>693 customers</w:t>
+            </w:r>
+          </w:p>
+        </w:tc>
+      </w:tr>
+    </w:tbl>
     <w:p>
       <w:pPr>
         <w:spacing w:before="160"/>
@@ -760,6 +826,7 @@
   <w:style w:type="paragraph" w:default="1" w:styleId="Normal">
     <w:name w:val="Normal"/>
     <w:qFormat/>
+    <w:rsid w:val="008E2831"/>
     <w:pPr>
       <w:spacing w:after="120" w:line="240" w:lineRule="auto"/>
     </w:pPr>
@@ -946,6 +1013,25 @@
       <w:sz w:val="30"/>
       <w:szCs w:val="30"/>
     </w:rPr>
+  </w:style>
+  <w:style w:type="table" w:styleId="TableGrid">
+    <w:name w:val="Table Grid"/>
+    <w:basedOn w:val="TableNormal"/>
+    <w:uiPriority w:val="39"/>
+    <w:rsid w:val="008E2831"/>
+    <w:pPr>
+      <w:spacing w:line="240" w:lineRule="auto"/>
+    </w:pPr>
+    <w:tblPr>
+      <w:tblBorders>
+        <w:top w:val="single" w:sz="4" w:space="0" w:color="auto"/>
+        <w:left w:val="single" w:sz="4" w:space="0" w:color="auto"/>
+        <w:bottom w:val="single" w:sz="4" w:space="0" w:color="auto"/>
+        <w:right w:val="single" w:sz="4" w:space="0" w:color="auto"/>
+        <w:insideH w:val="single" w:sz="4" w:space="0" w:color="auto"/>
+        <w:insideV w:val="single" w:sz="4" w:space="0" w:color="auto"/>
+      </w:tblBorders>
+    </w:tblPr>
   </w:style>
 </w:styles>
 </file>

</xml_diff>